<commit_message>
feat(proctoring): complete Phase B v1 — event timeline, testable logic, docs
- Admin drill-in: time-ordered integrity event timeline (backend endpoint
  now returns integrity_events; UI renders it under the integrity panel).
- Extracted the proctoring decision logic (debounced ranged-event state
  machine, warning selection, looking-away decision) into a pure module
  proctorLogic.ts and refactored useProctoring to use it — no behaviour
  change, now covered by 13 Vitest unit tests.
- EXPANSION_PLAN: marked Phase B v1 shipped and documented the deliberately
  deferred items (second_voice → needs diarization, identity verification,
  Web Worker, self-hosted model, threshold calibration, retention policy).

Tests: admin_ops 50, proctorLogic 13, AdminInterviewDetail 12 — all green.

Co-Authored-By: Claude Opus 4.8 (1M context) <noreply@anthropic.com>
</commit_message>
<xml_diff>
--- a/docs/EXPANSION_PLAN.docx
+++ b/docs/EXPANSION_PLAN.docx
@@ -1595,6 +1595,380 @@
       </w:pPr>
       <w:r>
         <w:t>Make the candidate aware proctoring is active (consent + visible indicator).</w:t>
+      </w:r>
+    </w:p>
+    <w:p>
+      <w:pPr>
+        <w:pStyle w:val="Heading3"/>
+      </w:pPr>
+      <w:r>
+        <w:rPr>
+          <w:color w:val="4F46E5"/>
+        </w:rPr>
+        <w:t>5.6 Status — Phase B v1 SHIPPED (2026-06-19)</w:t>
+      </w:r>
+    </w:p>
+    <w:p>
+      <w:r>
+        <w:rPr>
+          <w:b/>
+        </w:rPr>
+        <w:t>Built, tested, and live:</w:t>
+      </w:r>
+    </w:p>
+    <w:p>
+      <w:pPr>
+        <w:pStyle w:val="ListBullet"/>
+      </w:pPr>
+      <w:r>
+        <w:t xml:space="preserve">Client-side detection (browser, on-device): </w:t>
+      </w:r>
+      <w:r>
+        <w:rPr>
+          <w:b/>
+        </w:rPr>
+        <w:t>head-pose</w:t>
+      </w:r>
+      <w:r>
+        <w:t xml:space="preserve"> gaze (3D rotation</w:t>
+      </w:r>
+    </w:p>
+    <w:p>
+      <w:r>
+        <w:t xml:space="preserve">matrix), </w:t>
+      </w:r>
+      <w:r>
+        <w:rPr>
+          <w:b/>
+        </w:rPr>
+        <w:t>true eye-gaze</w:t>
+      </w:r>
+      <w:r>
+        <w:t xml:space="preserve"> (iris blendshapes), </w:t>
+      </w:r>
+      <w:r>
+        <w:rPr>
+          <w:b/>
+        </w:rPr>
+        <w:t>face-absent</w:t>
+      </w:r>
+      <w:r>
+        <w:t xml:space="preserve">, </w:t>
+      </w:r>
+      <w:r>
+        <w:rPr>
+          <w:b/>
+        </w:rPr>
+        <w:t>multiple-faces</w:t>
+      </w:r>
+      <w:r>
+        <w:t xml:space="preserve">, plus </w:t>
+      </w:r>
+      <w:r>
+        <w:rPr>
+          <w:b/>
+        </w:rPr>
+        <w:t>tab-switch / copy / paste / fullscreen-exit</w:t>
+      </w:r>
+      <w:r>
+        <w:t>. Raw video never leaves the device — only events.</w:t>
+      </w:r>
+    </w:p>
+    <w:p>
+      <w:pPr>
+        <w:pStyle w:val="ListBullet"/>
+      </w:pPr>
+      <w:r>
+        <w:t>Ingestion API (</w:t>
+      </w:r>
+      <w:r>
+        <w:rPr>
+          <w:rFonts w:ascii="Consolas" w:hAnsi="Consolas"/>
+        </w:rPr>
+        <w:t>POST /api/sessions/{id}/integrity-events</w:t>
+      </w:r>
+      <w:r>
+        <w:t>, ownership-checked) +</w:t>
+      </w:r>
+    </w:p>
+    <w:p>
+      <w:r>
+        <w:rPr>
+          <w:rFonts w:ascii="Consolas" w:hAnsi="Consolas"/>
+        </w:rPr>
+        <w:t>integrity_events</w:t>
+      </w:r>
+      <w:r>
+        <w:t xml:space="preserve"> table + rolling </w:t>
+      </w:r>
+      <w:r>
+        <w:rPr>
+          <w:rFonts w:ascii="Consolas" w:hAnsi="Consolas"/>
+        </w:rPr>
+        <w:t>integrity_score</w:t>
+      </w:r>
+      <w:r>
+        <w:t xml:space="preserve"> (0–100) + </w:t>
+      </w:r>
+      <w:r>
+        <w:rPr>
+          <w:rFonts w:ascii="Consolas" w:hAnsi="Consolas"/>
+        </w:rPr>
+        <w:t>proctoring_summary</w:t>
+      </w:r>
+      <w:r>
+        <w:t>.</w:t>
+      </w:r>
+    </w:p>
+    <w:p>
+      <w:pPr>
+        <w:pStyle w:val="ListBullet"/>
+      </w:pPr>
+      <w:r>
+        <w:t xml:space="preserve">Pure decision logic extracted to </w:t>
+      </w:r>
+      <w:r>
+        <w:rPr>
+          <w:rFonts w:ascii="Consolas" w:hAnsi="Consolas"/>
+        </w:rPr>
+        <w:t>web/.../proctorLogic.ts</w:t>
+      </w:r>
+      <w:r>
+        <w:t xml:space="preserve"> (debounce state</w:t>
+      </w:r>
+    </w:p>
+    <w:p>
+      <w:r>
+        <w:t xml:space="preserve">machine, warning selection, gaze decision) with </w:t>
+      </w:r>
+      <w:r>
+        <w:rPr>
+          <w:b/>
+        </w:rPr>
+        <w:t>13 Vitest unit tests</w:t>
+      </w:r>
+      <w:r>
+        <w:t xml:space="preserve">; backend scoring + endpoint covered by </w:t>
+      </w:r>
+      <w:r>
+        <w:rPr>
+          <w:b/>
+        </w:rPr>
+        <w:t>13 pytest tests</w:t>
+      </w:r>
+      <w:r>
+        <w:t>.</w:t>
+      </w:r>
+    </w:p>
+    <w:p>
+      <w:pPr>
+        <w:pStyle w:val="ListBullet"/>
+      </w:pPr>
+      <w:r>
+        <w:rPr>
+          <w:b/>
+        </w:rPr>
+        <w:t>Live candidate warnings</w:t>
+      </w:r>
+      <w:r>
+        <w:t xml:space="preserve"> (on-screen, ≥5s sustained) for face-absent /</w:t>
+      </w:r>
+    </w:p>
+    <w:p>
+      <w:r>
+        <w:t>looking-away / multiple-faces.</w:t>
+      </w:r>
+    </w:p>
+    <w:p>
+      <w:pPr>
+        <w:pStyle w:val="ListBullet"/>
+      </w:pPr>
+      <w:r>
+        <w:t xml:space="preserve">Admin </w:t>
+      </w:r>
+      <w:r>
+        <w:rPr>
+          <w:b/>
+        </w:rPr>
+        <w:t>integrity panel</w:t>
+      </w:r>
+      <w:r>
+        <w:t xml:space="preserve"> with score, per-type flags, and a **time-ordered</w:t>
+      </w:r>
+    </w:p>
+    <w:p>
+      <w:r>
+        <w:t>event timeline**. Disclaimer: "AI-assisted flagging for human review."</w:t>
+      </w:r>
+    </w:p>
+    <w:p>
+      <w:pPr>
+        <w:pStyle w:val="ListBullet"/>
+      </w:pPr>
+      <w:r>
+        <w:t>Defense-in-depth: per-event duration clamp (900s) so a client clock bug can't</w:t>
+      </w:r>
+    </w:p>
+    <w:p>
+      <w:r>
+        <w:t>blow up the score.</w:t>
+      </w:r>
+    </w:p>
+    <w:p>
+      <w:r>
+        <w:rPr>
+          <w:b/>
+        </w:rPr>
+        <w:t>Deferred (by design — NOT in v1):</w:t>
+      </w:r>
+    </w:p>
+    <w:p>
+      <w:pPr>
+        <w:pStyle w:val="ListBullet"/>
+      </w:pPr>
+      <w:r>
+        <w:rPr>
+          <w:b/>
+        </w:rPr>
+        <w:t>`second_voice` detection</w:t>
+      </w:r>
+      <w:r>
+        <w:t xml:space="preserve"> — robustly distinguishing a second/background</w:t>
+      </w:r>
+    </w:p>
+    <w:p>
+      <w:r>
+        <w:t xml:space="preserve">speaker needs speaker </w:t>
+      </w:r>
+      <w:r>
+        <w:rPr>
+          <w:b/>
+        </w:rPr>
+        <w:t>diarization</w:t>
+      </w:r>
+      <w:r>
+        <w:t xml:space="preserve"> (or careful echo handling so the avatar's own audio isn't misread). Shipping a false-positive-prone version would undermine the "advisory" stance, so it's deferred. The scorer already reserves a weight for it (forward-compatible). Note: </w:t>
+      </w:r>
+      <w:r>
+        <w:rPr>
+          <w:rFonts w:ascii="Consolas" w:hAnsi="Consolas"/>
+        </w:rPr>
+        <w:t>multiple_faces</w:t>
+      </w:r>
+      <w:r>
+        <w:t xml:space="preserve"> already covers the *visible* helper case.</w:t>
+      </w:r>
+    </w:p>
+    <w:p>
+      <w:pPr>
+        <w:pStyle w:val="ListBullet"/>
+      </w:pPr>
+      <w:r>
+        <w:rPr>
+          <w:b/>
+        </w:rPr>
+        <w:t>Identity verification</w:t>
+      </w:r>
+      <w:r>
+        <w:t xml:space="preserve"> (face snapshot + match vs ID photo + liveness) —</w:t>
+      </w:r>
+    </w:p>
+    <w:p>
+      <w:r>
+        <w:t>the plan's proctoring "Phase 2".</w:t>
+      </w:r>
+    </w:p>
+    <w:p>
+      <w:pPr>
+        <w:pStyle w:val="ListBullet"/>
+      </w:pPr>
+      <w:r>
+        <w:rPr>
+          <w:b/>
+        </w:rPr>
+        <w:t>Web Worker</w:t>
+      </w:r>
+      <w:r>
+        <w:t xml:space="preserve"> for detection (currently main-thread at ~2 fps) — scaling polish.</w:t>
+      </w:r>
+    </w:p>
+    <w:p>
+      <w:pPr>
+        <w:pStyle w:val="ListBullet"/>
+      </w:pPr>
+      <w:r>
+        <w:rPr>
+          <w:b/>
+        </w:rPr>
+        <w:t>Self-hosting the MediaPipe model</w:t>
+      </w:r>
+      <w:r>
+        <w:t xml:space="preserve"> (currently loads from Google's CDN).</w:t>
+      </w:r>
+    </w:p>
+    <w:p>
+      <w:pPr>
+        <w:pStyle w:val="ListBullet"/>
+      </w:pPr>
+      <w:r>
+        <w:rPr>
+          <w:b/>
+        </w:rPr>
+        <w:t>Threshold calibration / optional candidate calibration step</w:t>
+      </w:r>
+      <w:r>
+        <w:t xml:space="preserve"> — current</w:t>
+      </w:r>
+    </w:p>
+    <w:p>
+      <w:r>
+        <w:t>thresholds are sensible defaults, tunable in one place (</w:t>
+      </w:r>
+      <w:r>
+        <w:rPr>
+          <w:rFonts w:ascii="Consolas" w:hAnsi="Consolas"/>
+        </w:rPr>
+        <w:t>proctorLogic.ts</w:t>
+      </w:r>
+      <w:r>
+        <w:t xml:space="preserve"> / </w:t>
+      </w:r>
+      <w:r>
+        <w:rPr>
+          <w:rFonts w:ascii="Consolas" w:hAnsi="Consolas"/>
+        </w:rPr>
+        <w:t>useProctoring.ts</w:t>
+      </w:r>
+      <w:r>
+        <w:t>).</w:t>
+      </w:r>
+    </w:p>
+    <w:p>
+      <w:pPr>
+        <w:pStyle w:val="ListBullet"/>
+      </w:pPr>
+      <w:r>
+        <w:rPr>
+          <w:b/>
+        </w:rPr>
+        <w:t>Proctoring data retention policy</w:t>
+      </w:r>
+      <w:r>
+        <w:t xml:space="preserve"> — fold </w:t>
+      </w:r>
+      <w:r>
+        <w:rPr>
+          <w:rFonts w:ascii="Consolas" w:hAnsi="Consolas"/>
+        </w:rPr>
+        <w:t>integrity_events</w:t>
+      </w:r>
+      <w:r>
+        <w:t xml:space="preserve"> into the DPDP</w:t>
+      </w:r>
+    </w:p>
+    <w:p>
+      <w:r>
+        <w:t>retention/erasure job before production.</w:t>
       </w:r>
     </w:p>
     <w:p>

</xml_diff>

<commit_message>
docs: remove identity verification from proctoring scope
Dropped identity verification (face-match vs ID + liveness) from the
roadmap — unworkable for fresh/off-campus recruits at a new company, where
there is no ID document to match against. Regenerated PDF/DOCX.

Co-Authored-By: Claude Opus 4.8 (1M context) <noreply@anthropic.com>
</commit_message>
<xml_diff>
--- a/docs/EXPANSION_PLAN.docx
+++ b/docs/EXPANSION_PLAN.docx
@@ -1857,25 +1857,6 @@
       </w:r>
       <w:r>
         <w:t xml:space="preserve"> already covers the *visible* helper case.</w:t>
-      </w:r>
-    </w:p>
-    <w:p>
-      <w:pPr>
-        <w:pStyle w:val="ListBullet"/>
-      </w:pPr>
-      <w:r>
-        <w:rPr>
-          <w:b/>
-        </w:rPr>
-        <w:t>Identity verification</w:t>
-      </w:r>
-      <w:r>
-        <w:t xml:space="preserve"> (face snapshot + match vs ID photo + liveness) —</w:t>
-      </w:r>
-    </w:p>
-    <w:p>
-      <w:r>
-        <w:t>the plan's proctoring "Phase 2".</w:t>
       </w:r>
     </w:p>
     <w:p>

</xml_diff>